<commit_message>
Fin de la rédaction V1
</commit_message>
<xml_diff>
--- a/BASKETBALL/Planification_demarche_amelioration.docx
+++ b/BASKETBALL/Planification_demarche_amelioration.docx
@@ -99,10 +99,31 @@
         <w:spacing w:line="360" w:lineRule="auto"/>
       </w:pPr>
       <w:r>
-        <w:t>Lors de mon exécution du geste technique, je n’arrive pas à garder la tête haute afin d’avoir un œil sur ma cible, c’est-à-dire le panier car je fais que regarder le ballon lors de mon dribble.</w:t>
-      </w:r>
-      <w:r>
-        <w:t xml:space="preserve"> Donc pour améliorer ce point, il faut que je m’assure de toujours avoir la tête haute pendant mon dribble ne pas me laisser distraire par la balle.</w:t>
+        <w:t>Lors de mon exécution du geste technique, je n’arrive pas à garder la tête haute afin d’avoir un œil sur ma cible, c’est-à-dire le panier</w:t>
+      </w:r>
+      <w:r>
+        <w:t>,</w:t>
+      </w:r>
+      <w:r>
+        <w:t xml:space="preserve"> car je fais que regarder le ballon lors de mon dribble.</w:t>
+      </w:r>
+      <w:r>
+        <w:t xml:space="preserve"> Donc pour améliorer ce point, il faut que je m’assure de toujours avoir la tête haute pendant mon dribble </w:t>
+      </w:r>
+      <w:r>
+        <w:t xml:space="preserve">afin de </w:t>
+      </w:r>
+      <w:r>
+        <w:t>ne pas me laisser distraire par la balle.</w:t>
+      </w:r>
+      <w:r>
+        <w:t xml:space="preserve"> </w:t>
+      </w:r>
+      <w:r>
+        <w:t>Bref</w:t>
+      </w:r>
+      <w:r>
+        <w:t>, si je garde la tête haute je pourrais voir le panier et anticiper les défenseurs, ce qui rendra mon geste plus efficace en situation de match.</w:t>
       </w:r>
     </w:p>
     <w:p>
@@ -123,13 +144,22 @@
       <w:r>
         <w:t>, pour améliorer ce geste il faut que je pratique la vitesse de chacun de mes pas en ayant le focus sur ceux-ci.</w:t>
       </w:r>
-    </w:p>
-    <w:p>
-      <w:pPr>
-        <w:spacing w:line="360" w:lineRule="auto"/>
-      </w:pPr>
-      <w:r>
-        <w:t>En contrôle du ballon</w:t>
+      <w:r>
+        <w:t xml:space="preserve"> Donc, maintenir une bonne vitesse lors de mon approche me permettra de déstabiliser la défense et rendre mon geste plus difficile à contrer</w:t>
+      </w:r>
+      <w:r>
+        <w:t>.</w:t>
+      </w:r>
+    </w:p>
+    <w:p>
+      <w:pPr>
+        <w:spacing w:line="360" w:lineRule="auto"/>
+      </w:pPr>
+      <w:r>
+        <w:t>C</w:t>
+      </w:r>
+      <w:r>
+        <w:t>ontrôle du ballon</w:t>
       </w:r>
     </w:p>
     <w:p>
@@ -138,6 +168,15 @@
       </w:pPr>
       <w:r>
         <w:t>Pendant mon dribble, je n’arrive pas à contrôler la hauteur du ballon car celui-ci rebondit plus haut que ma taille. Pour éviter ce problème, il faut que je donne moins de force dans la balle lorsque je fais le dribble afin d’avoir un bon contrôle de balle.</w:t>
+      </w:r>
+    </w:p>
+    <w:p>
+      <w:pPr>
+        <w:spacing w:line="360" w:lineRule="auto"/>
+      </w:pPr>
+      <w:r>
+        <w:lastRenderedPageBreak/>
+        <w:t>Alors, avoir un bon contrôle de la hauteur du ballon me permettra de mieux gérer mon dribble et de réduire les risques de perdre le ballon avant d’arriver au panier.</w:t>
       </w:r>
     </w:p>
     <w:p>
@@ -162,63 +201,111 @@
         <w:spacing w:line="360" w:lineRule="auto"/>
       </w:pPr>
       <w:r>
+        <w:t xml:space="preserve">Avant de mettre le ballon dans le panier, j’ai un problème lors de mon saut. Je n’arrive pas à avoir la coordination nécessaire afin de d’utiliser le premier pas adéquat, </w:t>
+      </w:r>
+      <w:r>
+        <w:t>c’est-à-dire le pied gauche afin de prendre un bon appui au sol. Pour travailler ce geste, je dois pratiquer ma coordination lorsque je m’apprête à prendre appui au sol.</w:t>
+      </w:r>
+      <w:r>
+        <w:t xml:space="preserve"> Ce qui fait que si j’utilise le bon pied d’appui en fonction du coté de mon lay up, j’aurais une meilleure stabilité au sol, ce qui me permettra de générer plus de puissance lors de mon saut.</w:t>
+      </w:r>
+    </w:p>
+    <w:p>
+      <w:pPr>
+        <w:spacing w:line="360" w:lineRule="auto"/>
+      </w:pPr>
+      <w:r>
+        <w:t xml:space="preserve">2eme appui sur le pied </w:t>
+      </w:r>
+      <w:r>
+        <w:t>intérieur</w:t>
+      </w:r>
+    </w:p>
+    <w:p>
+      <w:pPr>
+        <w:spacing w:line="360" w:lineRule="auto"/>
+      </w:pPr>
+      <w:r>
+        <w:t xml:space="preserve">Vu que je n’arrive pas à utiliser le bon pied(gauche) d’appui pour </w:t>
+      </w:r>
+      <w:r>
+        <w:t>sauter, lorsque je veux me propulser dans les airs, je me mélange en utilisant le pied droit, aussi mon pied de propulsion n’est pas vraiment positionné à l’intérieur, pour arranger cela il faut que j’arrive à bien positionner mon pied, ainsi qu’améliorer ma coordination.</w:t>
+      </w:r>
+      <w:r>
+        <w:t xml:space="preserve"> </w:t>
+      </w:r>
+      <w:r>
+        <w:t>Bref, b</w:t>
+      </w:r>
+      <w:r>
+        <w:t>ien positionner mon pied de propulsion à l'intérieur me permettra de mieux diriger mon élan vers le haut plutôt que vers l'avant, ce qui améliorera la hauteur de mon saut</w:t>
+      </w:r>
+      <w:r>
+        <w:t>.</w:t>
+      </w:r>
+    </w:p>
+    <w:p>
+      <w:pPr>
+        <w:spacing w:line="360" w:lineRule="auto"/>
+      </w:pPr>
+      <w:r>
+        <w:t>Transférer la vitesse Horizontale en vitesse verticale</w:t>
+      </w:r>
+    </w:p>
+    <w:p>
+      <w:pPr>
+        <w:spacing w:line="360" w:lineRule="auto"/>
+      </w:pPr>
+      <w:r>
+        <w:t>En pratiquant mon geste juste avant le saut, je ne transférais pas la vitesse de ma course à la verticale en baissant mon centre de gravité. Pour inculquer ce geste dans ma routine de saut, il faut que je plie les genoux juste avant le saut afin d’avoir assez de détente pour aller plus haut.</w:t>
+      </w:r>
+      <w:r>
+        <w:t xml:space="preserve"> </w:t>
+      </w:r>
+      <w:r>
+        <w:t>Donc</w:t>
+      </w:r>
+      <w:r>
+        <w:t>,</w:t>
+      </w:r>
+      <w:r>
+        <w:t xml:space="preserve"> </w:t>
+      </w:r>
+      <w:r>
+        <w:t>p</w:t>
+      </w:r>
+      <w:r>
+        <w:t>lier les genoux avant le saut me permettra de convertir mon élan de course en hauteur, ce qui me donnera plus de détente pour atteindre le panier plus facilement.</w:t>
+      </w:r>
+      <w:r>
+        <w:t xml:space="preserve"> </w:t>
+      </w:r>
+    </w:p>
+    <w:p>
+      <w:pPr>
+        <w:spacing w:line="360" w:lineRule="auto"/>
+      </w:pPr>
+      <w:r>
+        <w:t>Garder sa vitesse lors du mouvement</w:t>
+      </w:r>
+    </w:p>
+    <w:p>
+      <w:pPr>
+        <w:spacing w:line="360" w:lineRule="auto"/>
+      </w:pPr>
+      <w:r>
         <w:lastRenderedPageBreak/>
-        <w:t xml:space="preserve">Avant de mettre le ballon dans le panier, j’ai un problème lors de mon saut. Je n’arrive pas à avoir la coordination nécessaire afin de d’utiliser le premier pas adéquat, </w:t>
-      </w:r>
-      <w:r>
-        <w:t>c’est-à-dire le pied gauche afin de prendre un bon appui au sol. Pour travailler ce geste, je dois pratiquer ma coordination lorsque je m’apprête à prendre appui au sol.</w:t>
-      </w:r>
-    </w:p>
-    <w:p>
-      <w:pPr>
-        <w:spacing w:line="360" w:lineRule="auto"/>
-      </w:pPr>
-      <w:r>
-        <w:t>2eme appui sur le pied extérieur</w:t>
-      </w:r>
-    </w:p>
-    <w:p>
-      <w:pPr>
-        <w:spacing w:line="360" w:lineRule="auto"/>
-      </w:pPr>
-      <w:r>
-        <w:t xml:space="preserve">Vu que je n’arrive pas à utiliser le bon pied(gauche) d’appui pour </w:t>
-      </w:r>
-      <w:r>
-        <w:t>sauter, lorsque je veux me propulser dans les airs, je me mélange en utilisant le pied droit, aussi mon pied de propulsion n’est pas vraiment positionné à l’intérieur, pour arranger cela il faut que j’arrive à bien positionner mon pied, ainsi qu’améliorer ma coordination.</w:t>
-      </w:r>
-    </w:p>
-    <w:p>
-      <w:pPr>
-        <w:spacing w:line="360" w:lineRule="auto"/>
-      </w:pPr>
-      <w:r>
-        <w:t>Transférer la vitesse Horizontale en vitesse verticale</w:t>
-      </w:r>
-    </w:p>
-    <w:p>
-      <w:pPr>
-        <w:spacing w:line="360" w:lineRule="auto"/>
-      </w:pPr>
-      <w:r>
-        <w:t>En pratiquant mon geste juste avant le saut, je ne transférais pas la vitesse de ma course à la verticale en baissant mon centre de gravité. Pour inculquer ce geste dans ma routine de saut, il faut que je plie les genoux juste avant le saut afin d’avoir assez de détente pour aller plus haut.</w:t>
-      </w:r>
-    </w:p>
-    <w:p>
-      <w:pPr>
-        <w:spacing w:line="360" w:lineRule="auto"/>
-      </w:pPr>
-      <w:r>
-        <w:t>Garder sa vitesse lors du mouvement</w:t>
-      </w:r>
-    </w:p>
-    <w:p>
-      <w:pPr>
-        <w:spacing w:line="360" w:lineRule="auto"/>
-      </w:pPr>
-      <w:r>
         <w:t>Lorsque j’approche du panier pour faire mon mouvement, j’ai tendance à ralentir avant de sauter ce qui me pénalise lors de l’exécution du geste car je perds de l’élan, pour améliorer cette partie il faut que je corrige la distance que je dois avoir avant mon saut.</w:t>
       </w:r>
+      <w:r>
+        <w:t xml:space="preserve"> Alors, c</w:t>
+      </w:r>
+      <w:r>
+        <w:t>orriger ma distance de départ avant le saut me permettra de conserver mon élan jusqu'au dernier moment, ce qui rendra mon saut plus puissant et mon geste plus fluide</w:t>
+      </w:r>
+      <w:r>
+        <w:t>.</w:t>
+      </w:r>
     </w:p>
     <w:p>
       <w:pPr>
@@ -235,6 +322,12 @@
       <w:r>
         <w:t>Avant de déposer la balle sur le panneau afin qu’elle tombe dans le filet, je ne fais pas le fouetté, ce qui fait que je peux manquer de force, lorsque veux déposer la balle, pour pratiquer ceci, il faut que je pratique mon mouvement de poignet afin de réaliser le fouetté.</w:t>
       </w:r>
+      <w:r>
+        <w:t xml:space="preserve"> Bref, m</w:t>
+      </w:r>
+      <w:r>
+        <w:t>aîtriser le fouetté du poignet me permettra de mieux contrôler la direction et la force avec laquelle je dépose le ballon sur le panneau, augmentant ainsi mes chances de marquer.</w:t>
+      </w:r>
     </w:p>
     <w:p>
       <w:pPr>
@@ -249,28 +342,109 @@
         <w:spacing w:line="360" w:lineRule="auto"/>
       </w:pPr>
       <w:r>
+        <w:t xml:space="preserve">Lorsque je réalise mon lay up, j’ai de la difficulté à évaluer la distance nécessaire pour faire mes pas et mon saut, pour améliorer ceci, je dois avoir un </w:t>
+      </w:r>
+      <w:r>
+        <w:t>repère</w:t>
+      </w:r>
+      <w:r>
+        <w:t xml:space="preserve"> afin de m’aider </w:t>
+      </w:r>
+      <w:r>
+        <w:t>à savoir où commencer à sauter.</w:t>
+      </w:r>
+      <w:r>
+        <w:t xml:space="preserve"> Alors, a</w:t>
+      </w:r>
+      <w:r>
+        <w:t>voir un repère au sol me permettra d'évaluer correctement la distance idéale pour mes pas et mon saut, ce qui rendra mon geste plus précis et plus constant.</w:t>
+      </w:r>
+    </w:p>
+    <w:p>
+      <w:pPr>
+        <w:spacing w:line="360" w:lineRule="auto"/>
+      </w:pPr>
+      <w:r>
+        <w:t>3) Exemple</w:t>
+      </w:r>
+      <w:r>
+        <w:t xml:space="preserve"> </w:t>
+      </w:r>
+      <w:r>
+        <w:t>détaillé</w:t>
+      </w:r>
+    </w:p>
+    <w:p>
+      <w:pPr>
+        <w:spacing w:line="360" w:lineRule="auto"/>
+      </w:pPr>
+      <w:r>
+        <w:t>Afin de maitriser mon geste technique, je peux utiliser plusieurs moyens pour m’aider. Par exemple</w:t>
+      </w:r>
+      <w:r>
+        <w:t xml:space="preserve">, </w:t>
+      </w:r>
+      <w:r>
+        <w:t xml:space="preserve">pour améliorer la coordination de mes pas, je peux utiliser un marqueur au sol qui me servira de repère pour bien placer mon pied d’appui avant </w:t>
+      </w:r>
+      <w:r>
+        <w:t xml:space="preserve">de faire </w:t>
+      </w:r>
+      <w:r>
+        <w:t xml:space="preserve">mon saut. De plus, pour travailler mon contrôle de balle pour ne pas avoir le ballon qui est au-dessus de ma taille lors de mon dribble, je peux </w:t>
+      </w:r>
+      <w:r>
+        <w:t xml:space="preserve">m’entrainer à diminuer la distance entre ma main et le sol afin de pouvoir mieux contrôler les bonds. Pour maitriser mon fouetté, je peux faire des mouvements de poignets sans </w:t>
+      </w:r>
+      <w:r>
         <w:lastRenderedPageBreak/>
-        <w:t xml:space="preserve">Lorsque je réalise mon lay up, j’ai de la difficulté à évaluer la distance nécessaire pour faire mes pas et mon saut, pour améliorer ceci, je dois avoir un </w:t>
-      </w:r>
-      <w:r>
-        <w:t>Reppert</w:t>
-      </w:r>
-      <w:r>
-        <w:t xml:space="preserve"> afin de m’aider </w:t>
-      </w:r>
-      <w:r>
-        <w:t>à savoir où commencer à sauter.</w:t>
-      </w:r>
-    </w:p>
-    <w:p>
-      <w:pPr>
-        <w:spacing w:line="360" w:lineRule="auto"/>
-      </w:pPr>
-      <w:r>
-        <w:t>3) Exemples détaillées.</w:t>
-      </w:r>
-    </w:p>
-    <w:p/>
+        <w:t xml:space="preserve">la balle afin de maitriser les gestes, ensuite, je peux réaliser le mouvement avec la balle. Encore, pour améliorer le fait que je dois </w:t>
+      </w:r>
+      <w:r>
+        <w:t>garder</w:t>
+      </w:r>
+      <w:r>
+        <w:t xml:space="preserve"> la tête haute lors de mon dribble</w:t>
+      </w:r>
+      <w:r>
+        <w:t>, je peux utiliser les l</w:t>
+      </w:r>
+      <w:r>
+        <w:t xml:space="preserve">unettes ce qui m’aidera à ne pas regarder autre </w:t>
+      </w:r>
+      <w:r>
+        <w:t>part</w:t>
+      </w:r>
+      <w:r>
+        <w:t xml:space="preserve"> que ma cible tout en </w:t>
+      </w:r>
+      <w:r>
+        <w:t>ayant la</w:t>
+      </w:r>
+      <w:r>
+        <w:t xml:space="preserve"> tête droite.</w:t>
+      </w:r>
+    </w:p>
+    <w:p>
+      <w:r>
+        <w:t>4) Références</w:t>
+      </w:r>
+    </w:p>
+    <w:p>
+      <w:r>
+        <w:t xml:space="preserve">MESSIER, Catherine. (Hiver 2026). </w:t>
+      </w:r>
+      <w:r>
+        <w:rPr>
+          <w:i/>
+          <w:iCs/>
+        </w:rPr>
+        <w:t>Document de référence sur les gestes techniques du lancer, du lay up, du lay up reverse et d'un parcours chronométré</w:t>
+      </w:r>
+      <w:r>
+        <w:t>, CSTJ – Département d'éducation physique, créé A-16, modifié H-26.</w:t>
+      </w:r>
+    </w:p>
     <w:p/>
     <w:p/>
     <w:p/>

</xml_diff>

<commit_message>
Modification du fichier de basketball
</commit_message>
<xml_diff>
--- a/BASKETBALL/Planification_demarche_amelioration.docx
+++ b/BASKETBALL/Planification_demarche_amelioration.docx
@@ -226,7 +226,13 @@
         <w:spacing w:line="360" w:lineRule="auto"/>
       </w:pPr>
       <w:r>
-        <w:t xml:space="preserve">Vu que je n’arrive pas à utiliser le bon pied(gauche) d’appui pour </w:t>
+        <w:t>Vu que je n’arrive pas à utiliser le bon pied</w:t>
+      </w:r>
+      <w:r>
+        <w:t xml:space="preserve"> </w:t>
+      </w:r>
+      <w:r>
+        <w:t xml:space="preserve">(gauche) d’appui pour </w:t>
       </w:r>
       <w:r>
         <w:t>sauter, lorsque je veux me propulser dans les airs, je me mélange en utilisant le pied droit, aussi mon pied de propulsion n’est pas vraiment positionné à l’intérieur, pour arranger cela il faut que j’arrive à bien positionner mon pied, ainsi qu’améliorer ma coordination.</w:t>
@@ -394,11 +400,16 @@
         <w:t xml:space="preserve">mon saut. De plus, pour travailler mon contrôle de balle pour ne pas avoir le ballon qui est au-dessus de ma taille lors de mon dribble, je peux </w:t>
       </w:r>
       <w:r>
-        <w:t xml:space="preserve">m’entrainer à diminuer la distance entre ma main et le sol afin de pouvoir mieux contrôler les bonds. Pour maitriser mon fouetté, je peux faire des mouvements de poignets sans </w:t>
-      </w:r>
+        <w:t xml:space="preserve">m’entrainer à diminuer la distance entre ma main et le sol afin de pouvoir mieux contrôler les bonds. Pour maitriser mon fouetté, je peux faire des mouvements de poignet sans la </w:t>
+      </w:r>
+      <w:proofErr w:type="gramStart"/>
       <w:r>
         <w:lastRenderedPageBreak/>
-        <w:t xml:space="preserve">la balle afin de maitriser les gestes, ensuite, je peux réaliser le mouvement avec la balle. Encore, pour améliorer le fait que je dois </w:t>
+        <w:t>balle</w:t>
+      </w:r>
+      <w:proofErr w:type="gramEnd"/>
+      <w:r>
+        <w:t xml:space="preserve"> afin de maitriser les gestes, ensuite, je peux réaliser le mouvement avec la balle. Encore, pour améliorer le fait que je dois </w:t>
       </w:r>
       <w:r>
         <w:t>garder</w:t>
@@ -1160,6 +1171,7 @@
   <w:style w:type="character" w:default="1" w:styleId="Policepardfaut">
     <w:name w:val="Default Paragraph Font"/>
     <w:uiPriority w:val="1"/>
+    <w:semiHidden/>
     <w:unhideWhenUsed/>
   </w:style>
   <w:style w:type="table" w:default="1" w:styleId="TableauNormal">

</xml_diff>